<commit_message>
Final polishing of test case documents complete
</commit_message>
<xml_diff>
--- a/doc/DOCX originals/Calculatorz_Test_Cases_for_Error_Handler.docx
+++ b/doc/DOCX originals/Calculatorz_Test_Cases_for_Error_Handler.docx
@@ -97,7 +97,7 @@
         <w:rPr>
           <w:rtl w:val="0"/>
         </w:rPr>
-        <w:t xml:space="preserve">Test Cases for Error_Handler</w:t>
+        <w:t xml:space="preserve">Test Cases for Error_Handler Module</w:t>
       </w:r>
     </w:p>
     <w:p>
@@ -120,20 +120,9 @@
           <w:bCs w:val="0"/>
           <w:i w:val="1"/>
           <w:iCs w:val="1"/>
-          <w:smallCaps w:val="0"/>
-          <w:strike w:val="0"/>
           <w:sz w:val="20"/>
           <w:szCs w:val="20"/>
-          <w:u w:val="none"/>
-          <w:vertAlign w:val="baseline"/>
-        </w:rPr>
-        <w:sectPr>
-          <w:headerReference r:id="rId7" w:type="default"/>
-          <w:footerReference r:id="rId8" w:type="even"/>
-          <w:pgSz w:h="15840" w:w="12240" w:orient="portrait"/>
-          <w:pgMar w:bottom="1440" w:top="1440" w:left="1440" w:right="1440" w:header="720" w:footer="720"/>
-          <w:pgNumType w:start="1"/>
-        </w:sectPr>
+        </w:rPr>
       </w:pPr>
       <w:r>
         <w:rPr>
@@ -141,7 +130,10 @@
           <w:szCs w:val="28"/>
           <w:rtl w:val="0"/>
         </w:rPr>
-        <w:t xml:space="preserve">Version 1.1</w:t>
+        <w:t xml:space="preserve">Version 1.2</w:t>
+      </w:r>
+      <w:r>
+        <w:br w:type="page"/>
       </w:r>
       <w:r>
         <w:rPr>
@@ -911,48 +903,8 @@
               <w:rPr>
                 <w:rtl w:val="0"/>
               </w:rPr>
+              <w:t xml:space="preserve">2026-05-06</w:t>
             </w:r>
-          </w:p>
-        </w:tc>
-        <w:tc>
-          <w:tcPr>
-            <w:tcMar>
-              <w:top w:w="0.0" w:type="dxa"/>
-              <w:bottom w:w="0.0" w:type="dxa"/>
-            </w:tcMar>
-            <w:vAlign w:val="center"/>
-          </w:tcPr>
-          <w:p>
-            <w:pPr>
-              <w:keepNext w:val="0"/>
-              <w:keepLines w:val="1"/>
-              <w:pageBreakBefore w:val="0"/>
-              <w:widowControl w:val="0"/>
-              <w:pBdr>
-                <w:top w:space="0" w:sz="0" w:val="nil"/>
-                <w:left w:space="0" w:sz="0" w:val="nil"/>
-                <w:bottom w:space="0" w:sz="0" w:val="nil"/>
-                <w:right w:space="0" w:sz="0" w:val="nil"/>
-                <w:between w:space="0" w:sz="0" w:val="nil"/>
-              </w:pBdr>
-              <w:shd w:fill="auto" w:val="clear"/>
-              <w:spacing w:after="0" w:before="0" w:line="240" w:lineRule="auto"/>
-              <w:ind w:left="0" w:right="0" w:firstLine="0"/>
-              <w:jc w:val="left"/>
-              <w:rPr>
-                <w:rFonts w:ascii="Times New Roman" w:cs="Times New Roman" w:eastAsia="Times New Roman" w:hAnsi="Times New Roman"/>
-                <w:b w:val="0"/>
-                <w:bCs w:val="0"/>
-                <w:i w:val="0"/>
-                <w:iCs w:val="0"/>
-                <w:smallCaps w:val="0"/>
-                <w:strike w:val="0"/>
-                <w:sz w:val="20"/>
-                <w:szCs w:val="20"/>
-                <w:u w:val="none"/>
-                <w:vertAlign w:val="baseline"/>
-              </w:rPr>
-            </w:pPr>
             <w:r>
               <w:rPr>
                 <w:rtl w:val="0"/>
@@ -1003,6 +955,12 @@
               <w:rPr>
                 <w:rtl w:val="0"/>
               </w:rPr>
+              <w:t xml:space="preserve">1.2</w:t>
+            </w:r>
+            <w:r>
+              <w:rPr>
+                <w:rtl w:val="0"/>
+              </w:rPr>
             </w:r>
           </w:p>
         </w:tc>
@@ -1049,6 +1007,207 @@
               <w:rPr>
                 <w:rtl w:val="0"/>
               </w:rPr>
+              <w:t xml:space="preserve">Final polishing</w:t>
+            </w:r>
+            <w:r>
+              <w:rPr>
+                <w:rtl w:val="0"/>
+              </w:rPr>
+            </w:r>
+          </w:p>
+        </w:tc>
+        <w:tc>
+          <w:tcPr>
+            <w:tcMar>
+              <w:top w:w="0.0" w:type="dxa"/>
+              <w:bottom w:w="0.0" w:type="dxa"/>
+            </w:tcMar>
+            <w:vAlign w:val="center"/>
+          </w:tcPr>
+          <w:p>
+            <w:pPr>
+              <w:keepNext w:val="0"/>
+              <w:keepLines w:val="1"/>
+              <w:pageBreakBefore w:val="0"/>
+              <w:widowControl w:val="0"/>
+              <w:pBdr>
+                <w:top w:space="0" w:sz="0" w:val="nil"/>
+                <w:left w:space="0" w:sz="0" w:val="nil"/>
+                <w:bottom w:space="0" w:sz="0" w:val="nil"/>
+                <w:right w:space="0" w:sz="0" w:val="nil"/>
+                <w:between w:space="0" w:sz="0" w:val="nil"/>
+              </w:pBdr>
+              <w:shd w:fill="auto" w:val="clear"/>
+              <w:spacing w:after="0" w:before="0" w:line="240" w:lineRule="auto"/>
+              <w:ind w:left="0" w:right="0" w:firstLine="0"/>
+              <w:jc w:val="left"/>
+              <w:rPr>
+                <w:rFonts w:ascii="Times New Roman" w:cs="Times New Roman" w:eastAsia="Times New Roman" w:hAnsi="Times New Roman"/>
+                <w:b w:val="0"/>
+                <w:bCs w:val="0"/>
+                <w:i w:val="0"/>
+                <w:iCs w:val="0"/>
+                <w:smallCaps w:val="0"/>
+                <w:strike w:val="0"/>
+                <w:sz w:val="20"/>
+                <w:szCs w:val="20"/>
+                <w:u w:val="none"/>
+                <w:vertAlign w:val="baseline"/>
+              </w:rPr>
+            </w:pPr>
+            <w:r>
+              <w:rPr>
+                <w:rtl w:val="0"/>
+              </w:rPr>
+              <w:t xml:space="preserve">Isaiah</w:t>
+            </w:r>
+            <w:r>
+              <w:rPr>
+                <w:rtl w:val="0"/>
+              </w:rPr>
+            </w:r>
+          </w:p>
+        </w:tc>
+      </w:tr>
+      <w:tr>
+        <w:trPr>
+          <w:cantSplit w:val="0"/>
+          <w:trHeight w:val="355.98046875" w:hRule="atLeast"/>
+          <w:tblHeader w:val="0"/>
+        </w:trPr>
+        <w:tc>
+          <w:tcPr>
+            <w:tcMar>
+              <w:top w:w="0.0" w:type="dxa"/>
+              <w:bottom w:w="0.0" w:type="dxa"/>
+            </w:tcMar>
+            <w:vAlign w:val="center"/>
+          </w:tcPr>
+          <w:p>
+            <w:pPr>
+              <w:keepNext w:val="0"/>
+              <w:keepLines w:val="1"/>
+              <w:pageBreakBefore w:val="0"/>
+              <w:widowControl w:val="0"/>
+              <w:pBdr>
+                <w:top w:space="0" w:sz="0" w:val="nil"/>
+                <w:left w:space="0" w:sz="0" w:val="nil"/>
+                <w:bottom w:space="0" w:sz="0" w:val="nil"/>
+                <w:right w:space="0" w:sz="0" w:val="nil"/>
+                <w:between w:space="0" w:sz="0" w:val="nil"/>
+              </w:pBdr>
+              <w:shd w:fill="auto" w:val="clear"/>
+              <w:spacing w:after="0" w:before="0" w:line="240" w:lineRule="auto"/>
+              <w:ind w:left="0" w:right="0" w:firstLine="0"/>
+              <w:jc w:val="left"/>
+              <w:rPr/>
+            </w:pPr>
+            <w:r>
+              <w:rPr>
+                <w:rtl w:val="0"/>
+              </w:rPr>
+            </w:r>
+          </w:p>
+        </w:tc>
+        <w:tc>
+          <w:tcPr>
+            <w:tcMar>
+              <w:top w:w="0.0" w:type="dxa"/>
+              <w:bottom w:w="0.0" w:type="dxa"/>
+            </w:tcMar>
+            <w:vAlign w:val="center"/>
+          </w:tcPr>
+          <w:p>
+            <w:pPr>
+              <w:keepNext w:val="0"/>
+              <w:keepLines w:val="1"/>
+              <w:pageBreakBefore w:val="0"/>
+              <w:widowControl w:val="0"/>
+              <w:pBdr>
+                <w:top w:space="0" w:sz="0" w:val="nil"/>
+                <w:left w:space="0" w:sz="0" w:val="nil"/>
+                <w:bottom w:space="0" w:sz="0" w:val="nil"/>
+                <w:right w:space="0" w:sz="0" w:val="nil"/>
+                <w:between w:space="0" w:sz="0" w:val="nil"/>
+              </w:pBdr>
+              <w:shd w:fill="auto" w:val="clear"/>
+              <w:spacing w:after="0" w:before="0" w:line="240" w:lineRule="auto"/>
+              <w:ind w:left="0" w:right="0" w:firstLine="0"/>
+              <w:jc w:val="left"/>
+              <w:rPr/>
+            </w:pPr>
+            <w:r>
+              <w:rPr>
+                <w:rtl w:val="0"/>
+              </w:rPr>
+            </w:r>
+          </w:p>
+        </w:tc>
+        <w:tc>
+          <w:tcPr>
+            <w:tcMar>
+              <w:top w:w="0.0" w:type="dxa"/>
+              <w:bottom w:w="0.0" w:type="dxa"/>
+            </w:tcMar>
+            <w:vAlign w:val="center"/>
+          </w:tcPr>
+          <w:p>
+            <w:pPr>
+              <w:keepNext w:val="0"/>
+              <w:keepLines w:val="1"/>
+              <w:pageBreakBefore w:val="0"/>
+              <w:widowControl w:val="0"/>
+              <w:pBdr>
+                <w:top w:space="0" w:sz="0" w:val="nil"/>
+                <w:left w:space="0" w:sz="0" w:val="nil"/>
+                <w:bottom w:space="0" w:sz="0" w:val="nil"/>
+                <w:right w:space="0" w:sz="0" w:val="nil"/>
+                <w:between w:space="0" w:sz="0" w:val="nil"/>
+              </w:pBdr>
+              <w:shd w:fill="auto" w:val="clear"/>
+              <w:spacing w:after="0" w:before="0" w:line="240" w:lineRule="auto"/>
+              <w:ind w:left="0" w:right="0" w:firstLine="0"/>
+              <w:jc w:val="left"/>
+              <w:rPr/>
+            </w:pPr>
+            <w:r>
+              <w:rPr>
+                <w:rtl w:val="0"/>
+              </w:rPr>
+            </w:r>
+          </w:p>
+        </w:tc>
+        <w:tc>
+          <w:tcPr>
+            <w:tcMar>
+              <w:top w:w="0.0" w:type="dxa"/>
+              <w:bottom w:w="0.0" w:type="dxa"/>
+            </w:tcMar>
+            <w:vAlign w:val="center"/>
+          </w:tcPr>
+          <w:p>
+            <w:pPr>
+              <w:keepNext w:val="0"/>
+              <w:keepLines w:val="1"/>
+              <w:pageBreakBefore w:val="0"/>
+              <w:widowControl w:val="0"/>
+              <w:pBdr>
+                <w:top w:space="0" w:sz="0" w:val="nil"/>
+                <w:left w:space="0" w:sz="0" w:val="nil"/>
+                <w:bottom w:space="0" w:sz="0" w:val="nil"/>
+                <w:right w:space="0" w:sz="0" w:val="nil"/>
+                <w:between w:space="0" w:sz="0" w:val="nil"/>
+              </w:pBdr>
+              <w:shd w:fill="auto" w:val="clear"/>
+              <w:spacing w:after="0" w:before="0" w:line="240" w:lineRule="auto"/>
+              <w:ind w:left="0" w:right="0" w:firstLine="0"/>
+              <w:jc w:val="left"/>
+              <w:rPr/>
+            </w:pPr>
+            <w:r>
+              <w:rPr>
+                <w:rtl w:val="0"/>
+              </w:rPr>
             </w:r>
           </w:p>
         </w:tc>
@@ -1079,19 +1238,9 @@
         <w:t xml:space="preserve">Table of Contents</w:t>
       </w:r>
     </w:p>
-    <w:p>
-      <w:pPr>
-        <w:rPr/>
-      </w:pPr>
-      <w:r>
-        <w:rPr>
-          <w:rtl w:val="0"/>
-        </w:rPr>
-      </w:r>
-    </w:p>
     <w:sdt>
       <w:sdtPr>
-        <w:id w:val="-1452260871"/>
+        <w:id w:val="-309116304"/>
         <w:docPartObj>
           <w:docPartGallery w:val="Table of Contents"/>
           <w:docPartUnique w:val="1"/>
@@ -1738,7 +1887,7 @@
         <w:rPr>
           <w:rtl w:val="0"/>
         </w:rPr>
-        <w:t xml:space="preserve">Purpose </w:t>
+        <w:t xml:space="preserve">Purpose</w:t>
       </w:r>
     </w:p>
     <w:p>
@@ -6047,13 +6196,15 @@
       </w:r>
     </w:p>
     <w:sectPr>
-      <w:headerReference r:id="rId9" w:type="default"/>
-      <w:headerReference r:id="rId10" w:type="first"/>
-      <w:footerReference r:id="rId11" w:type="default"/>
-      <w:footerReference r:id="rId12" w:type="first"/>
-      <w:type w:val="nextPage"/>
+      <w:headerReference r:id="rId7" w:type="default"/>
+      <w:headerReference r:id="rId8" w:type="first"/>
+      <w:footerReference r:id="rId9" w:type="default"/>
+      <w:footerReference r:id="rId10" w:type="first"/>
+      <w:footerReference r:id="rId11" w:type="even"/>
       <w:pgSz w:h="15840" w:w="12240" w:orient="portrait"/>
       <w:pgMar w:bottom="1440" w:top="1440" w:left="1440" w:right="1440" w:header="720" w:footer="720"/>
+      <w:pgNumType w:start="1"/>
+      <w:titlePg w:val="1"/>
     </w:sectPr>
   </w:body>
 </w:document>
@@ -6175,224 +6326,7 @@
 <w:ftr xmlns:mc="http://schemas.openxmlformats.org/markup-compatibility/2006" xmlns:o="urn:schemas-microsoft-com:office:office" xmlns:r="http://schemas.openxmlformats.org/officeDocument/2006/relationships" xmlns:m="http://schemas.openxmlformats.org/officeDocument/2006/math" xmlns:v="urn:schemas-microsoft-com:vml" xmlns:wp="http://schemas.openxmlformats.org/drawingml/2006/wordprocessingDrawing" xmlns:w10="urn:schemas-microsoft-com:office:word" xmlns:w="http://schemas.openxmlformats.org/wordprocessingml/2006/main" xmlns:wne="http://schemas.microsoft.com/office/word/2006/wordml" xmlns:sl="http://schemas.openxmlformats.org/schemaLibrary/2006/main" xmlns:a="http://schemas.openxmlformats.org/drawingml/2006/main" xmlns:pic="http://schemas.openxmlformats.org/drawingml/2006/picture" xmlns:c="http://schemas.openxmlformats.org/drawingml/2006/chart" xmlns:lc="http://schemas.openxmlformats.org/drawingml/2006/lockedCanvas" xmlns:dgm="http://schemas.openxmlformats.org/drawingml/2006/diagram" xmlns:wps="http://schemas.microsoft.com/office/word/2010/wordprocessingShape" xmlns:wpg="http://schemas.microsoft.com/office/word/2010/wordprocessingGroup" xmlns:w14="http://schemas.microsoft.com/office/word/2010/wordml" xmlns:w15="http://schemas.microsoft.com/office/word/2012/wordml" xmlns:w16="http://schemas.microsoft.com/office/word/2018/wordml" xmlns:w16cex="http://schemas.microsoft.com/office/word/2018/wordml/cex" xmlns:w16cid="http://schemas.microsoft.com/office/word/2016/wordml/cid" xmlns="http://schemas.microsoft.com/office/tasks/2019/documenttasks" xmlns:cr="http://schemas.microsoft.com/office/comments/2020/reactions">
   <w:p>
     <w:pPr>
-      <w:keepNext w:val="0"/>
-      <w:keepLines w:val="0"/>
-      <w:pageBreakBefore w:val="0"/>
-      <w:widowControl w:val="0"/>
-      <w:pBdr>
-        <w:top w:space="0" w:sz="0" w:val="nil"/>
-        <w:left w:space="0" w:sz="0" w:val="nil"/>
-        <w:bottom w:space="0" w:sz="0" w:val="nil"/>
-        <w:right w:space="0" w:sz="0" w:val="nil"/>
-        <w:between w:space="0" w:sz="0" w:val="nil"/>
-      </w:pBdr>
-      <w:shd w:fill="auto" w:val="clear"/>
-      <w:spacing w:after="0" w:before="0" w:line="276" w:lineRule="auto"/>
-      <w:ind w:left="0" w:right="0" w:firstLine="0"/>
-      <w:jc w:val="left"/>
-      <w:rPr>
-        <w:rFonts w:ascii="Times New Roman" w:cs="Times New Roman" w:eastAsia="Times New Roman" w:hAnsi="Times New Roman"/>
-        <w:b w:val="0"/>
-        <w:bCs w:val="0"/>
-        <w:i w:val="0"/>
-        <w:iCs w:val="0"/>
-        <w:smallCaps w:val="0"/>
-        <w:strike w:val="0"/>
-        <w:color w:val="000000"/>
-        <w:sz w:val="20"/>
-        <w:szCs w:val="20"/>
-        <w:u w:val="none"/>
-        <w:shd w:fill="auto" w:val="clear"/>
-        <w:vertAlign w:val="baseline"/>
-      </w:rPr>
-    </w:pPr>
-    <w:r>
-      <w:rPr>
-        <w:rtl w:val="0"/>
-      </w:rPr>
-    </w:r>
-  </w:p>
-  <w:tbl>
-    <w:tblPr>
-      <w:tblStyle w:val="Table3"/>
-      <w:tblW w:w="9486.000000000002" w:type="dxa"/>
-      <w:jc w:val="left"/>
-      <w:tblInd w:w="-115.0" w:type="dxa"/>
-      <w:tblBorders>
-        <w:top w:color="000000" w:space="0" w:sz="6" w:val="single"/>
-        <w:left w:color="000000" w:space="0" w:sz="6" w:val="single"/>
-        <w:bottom w:color="000000" w:space="0" w:sz="6" w:val="single"/>
-        <w:right w:color="000000" w:space="0" w:sz="6" w:val="single"/>
-        <w:insideH w:color="000000" w:space="0" w:sz="6" w:val="single"/>
-        <w:insideV w:color="000000" w:space="0" w:sz="6" w:val="single"/>
-      </w:tblBorders>
-      <w:tblLayout w:type="fixed"/>
-      <w:tblLook w:val="0000"/>
-    </w:tblPr>
-    <w:tblGrid>
-      <w:gridCol w:w="2628"/>
-      <w:gridCol w:w="3696"/>
-      <w:gridCol w:w="3162"/>
-      <w:tblGridChange w:id="0">
-        <w:tblGrid>
-          <w:gridCol w:w="2628"/>
-          <w:gridCol w:w="3696"/>
-          <w:gridCol w:w="3162"/>
-        </w:tblGrid>
-      </w:tblGridChange>
-    </w:tblGrid>
-    <w:tr>
-      <w:trPr>
-        <w:cantSplit w:val="0"/>
-        <w:tblHeader w:val="0"/>
-      </w:trPr>
-      <w:tc>
-        <w:tcPr>
-          <w:tcBorders>
-            <w:top w:color="000000" w:space="0" w:sz="0" w:val="nil"/>
-            <w:left w:color="000000" w:space="0" w:sz="0" w:val="nil"/>
-            <w:bottom w:color="000000" w:space="0" w:sz="0" w:val="nil"/>
-            <w:right w:color="000000" w:space="0" w:sz="0" w:val="nil"/>
-          </w:tcBorders>
-          <w:tcMar>
-            <w:top w:w="0.0" w:type="dxa"/>
-            <w:bottom w:w="0.0" w:type="dxa"/>
-          </w:tcMar>
-        </w:tcPr>
-        <w:p>
-          <w:pPr>
-            <w:ind w:right="360"/>
-            <w:rPr/>
-          </w:pPr>
-          <w:r>
-            <w:rPr>
-              <w:rtl w:val="0"/>
-            </w:rPr>
-            <w:t xml:space="preserve">Confidential</w:t>
-          </w:r>
-        </w:p>
-      </w:tc>
-      <w:tc>
-        <w:tcPr>
-          <w:tcBorders>
-            <w:top w:color="000000" w:space="0" w:sz="0" w:val="nil"/>
-            <w:left w:color="000000" w:space="0" w:sz="0" w:val="nil"/>
-            <w:bottom w:color="000000" w:space="0" w:sz="0" w:val="nil"/>
-            <w:right w:color="000000" w:space="0" w:sz="0" w:val="nil"/>
-          </w:tcBorders>
-          <w:tcMar>
-            <w:top w:w="0.0" w:type="dxa"/>
-            <w:bottom w:w="0.0" w:type="dxa"/>
-          </w:tcMar>
-        </w:tcPr>
-        <w:p>
-          <w:pPr>
-            <w:jc w:val="center"/>
-            <w:rPr/>
-          </w:pPr>
-          <w:r>
-            <w:rPr>
-              <w:rtl w:val="0"/>
-            </w:rPr>
-            <w:t xml:space="preserve">©</w:t>
-          </w:r>
-          <w:r>
-            <w:fldChar w:fldCharType="begin"/>
-            <w:instrText xml:space="preserve"> DOCPROPERTY "Company"</w:instrText>
-            <w:fldChar w:fldCharType="separate"/>
-          </w:r>
-          <w:r>
-            <w:rPr>
-              <w:rtl w:val="0"/>
-            </w:rPr>
-            <w:t xml:space="preserve">Calculatorz</w:t>
-          </w:r>
-          <w:r>
-            <w:fldChar w:fldCharType="end"/>
-          </w:r>
-          <w:r>
-            <w:rPr>
-              <w:rtl w:val="0"/>
-            </w:rPr>
-          </w:r>
-        </w:p>
-      </w:tc>
-      <w:tc>
-        <w:tcPr>
-          <w:tcBorders>
-            <w:top w:color="000000" w:space="0" w:sz="0" w:val="nil"/>
-            <w:left w:color="000000" w:space="0" w:sz="0" w:val="nil"/>
-            <w:bottom w:color="000000" w:space="0" w:sz="0" w:val="nil"/>
-            <w:right w:color="000000" w:space="0" w:sz="0" w:val="nil"/>
-          </w:tcBorders>
-          <w:tcMar>
-            <w:top w:w="0.0" w:type="dxa"/>
-            <w:bottom w:w="0.0" w:type="dxa"/>
-          </w:tcMar>
-        </w:tcPr>
-        <w:p>
-          <w:pPr>
-            <w:jc w:val="right"/>
-            <w:rPr/>
-          </w:pPr>
-          <w:r>
-            <w:rPr>
-              <w:rtl w:val="0"/>
-            </w:rPr>
-            <w:t xml:space="preserve">Page </w:t>
-          </w:r>
-          <w:r>
-            <w:rPr/>
-            <w:fldChar w:fldCharType="begin"/>
-            <w:instrText xml:space="preserve">PAGE</w:instrText>
-            <w:fldChar w:fldCharType="separate"/>
-            <w:fldChar w:fldCharType="end"/>
-          </w:r>
-          <w:r>
-            <w:rPr>
-              <w:rtl w:val="0"/>
-            </w:rPr>
-          </w:r>
-        </w:p>
-      </w:tc>
-    </w:tr>
-  </w:tbl>
-  <w:p>
-    <w:pPr>
-      <w:keepNext w:val="0"/>
-      <w:keepLines w:val="0"/>
-      <w:pageBreakBefore w:val="0"/>
-      <w:widowControl w:val="0"/>
-      <w:pBdr>
-        <w:top w:space="0" w:sz="0" w:val="nil"/>
-        <w:left w:space="0" w:sz="0" w:val="nil"/>
-        <w:bottom w:space="0" w:sz="0" w:val="nil"/>
-        <w:right w:space="0" w:sz="0" w:val="nil"/>
-        <w:between w:space="0" w:sz="0" w:val="nil"/>
-      </w:pBdr>
-      <w:shd w:fill="auto" w:val="clear"/>
-      <w:tabs>
-        <w:tab w:val="center" w:leader="none" w:pos="4320"/>
-        <w:tab w:val="right" w:leader="none" w:pos="8640"/>
-      </w:tabs>
-      <w:spacing w:after="0" w:before="0" w:line="240" w:lineRule="auto"/>
-      <w:ind w:left="0" w:right="0" w:firstLine="0"/>
-      <w:jc w:val="left"/>
-      <w:rPr>
-        <w:rFonts w:ascii="Times New Roman" w:cs="Times New Roman" w:eastAsia="Times New Roman" w:hAnsi="Times New Roman"/>
-        <w:b w:val="0"/>
-        <w:bCs w:val="0"/>
-        <w:i w:val="0"/>
-        <w:iCs w:val="0"/>
-        <w:smallCaps w:val="0"/>
-        <w:strike w:val="0"/>
-        <w:color w:val="000000"/>
-        <w:sz w:val="20"/>
-        <w:szCs w:val="20"/>
-        <w:u w:val="none"/>
-        <w:shd w:fill="auto" w:val="clear"/>
-        <w:vertAlign w:val="baseline"/>
-      </w:rPr>
+      <w:rPr/>
     </w:pPr>
     <w:r>
       <w:rPr>
@@ -6407,40 +6341,153 @@
 <w:ftr xmlns:mc="http://schemas.openxmlformats.org/markup-compatibility/2006" xmlns:o="urn:schemas-microsoft-com:office:office" xmlns:r="http://schemas.openxmlformats.org/officeDocument/2006/relationships" xmlns:m="http://schemas.openxmlformats.org/officeDocument/2006/math" xmlns:v="urn:schemas-microsoft-com:vml" xmlns:wp="http://schemas.openxmlformats.org/drawingml/2006/wordprocessingDrawing" xmlns:w10="urn:schemas-microsoft-com:office:word" xmlns:w="http://schemas.openxmlformats.org/wordprocessingml/2006/main" xmlns:wne="http://schemas.microsoft.com/office/word/2006/wordml" xmlns:sl="http://schemas.openxmlformats.org/schemaLibrary/2006/main" xmlns:a="http://schemas.openxmlformats.org/drawingml/2006/main" xmlns:pic="http://schemas.openxmlformats.org/drawingml/2006/picture" xmlns:c="http://schemas.openxmlformats.org/drawingml/2006/chart" xmlns:lc="http://schemas.openxmlformats.org/drawingml/2006/lockedCanvas" xmlns:dgm="http://schemas.openxmlformats.org/drawingml/2006/diagram" xmlns:wps="http://schemas.microsoft.com/office/word/2010/wordprocessingShape" xmlns:wpg="http://schemas.microsoft.com/office/word/2010/wordprocessingGroup" xmlns:w14="http://schemas.microsoft.com/office/word/2010/wordml" xmlns:w15="http://schemas.microsoft.com/office/word/2012/wordml" xmlns:w16="http://schemas.microsoft.com/office/word/2018/wordml" xmlns:w16cex="http://schemas.microsoft.com/office/word/2018/wordml/cex" xmlns:w16cid="http://schemas.microsoft.com/office/word/2016/wordml/cid" xmlns="http://schemas.microsoft.com/office/tasks/2019/documenttasks" xmlns:cr="http://schemas.microsoft.com/office/comments/2020/reactions">
   <w:p>
     <w:pPr>
-      <w:keepNext w:val="0"/>
-      <w:keepLines w:val="0"/>
-      <w:pageBreakBefore w:val="0"/>
-      <w:widowControl w:val="0"/>
-      <w:pBdr>
-        <w:top w:space="0" w:sz="0" w:val="nil"/>
-        <w:left w:space="0" w:sz="0" w:val="nil"/>
-        <w:bottom w:space="0" w:sz="0" w:val="nil"/>
-        <w:right w:space="0" w:sz="0" w:val="nil"/>
-        <w:between w:space="0" w:sz="0" w:val="nil"/>
-      </w:pBdr>
-      <w:shd w:fill="auto" w:val="clear"/>
-      <w:tabs>
-        <w:tab w:val="center" w:leader="none" w:pos="4320"/>
-        <w:tab w:val="right" w:leader="none" w:pos="8640"/>
-      </w:tabs>
-      <w:spacing w:after="0" w:before="0" w:line="240" w:lineRule="auto"/>
-      <w:ind w:left="0" w:right="0" w:firstLine="0"/>
-      <w:jc w:val="left"/>
+      <w:spacing w:line="276" w:lineRule="auto"/>
+      <w:rPr/>
+    </w:pPr>
+    <w:r>
       <w:rPr>
-        <w:rFonts w:ascii="Times New Roman" w:cs="Times New Roman" w:eastAsia="Times New Roman" w:hAnsi="Times New Roman"/>
-        <w:b w:val="0"/>
-        <w:bCs w:val="0"/>
-        <w:i w:val="0"/>
-        <w:iCs w:val="0"/>
-        <w:smallCaps w:val="0"/>
-        <w:strike w:val="0"/>
-        <w:color w:val="000000"/>
-        <w:sz w:val="20"/>
-        <w:szCs w:val="20"/>
-        <w:u w:val="none"/>
-        <w:shd w:fill="auto" w:val="clear"/>
-        <w:vertAlign w:val="baseline"/>
+        <w:rtl w:val="0"/>
       </w:rPr>
+    </w:r>
+  </w:p>
+  <w:sdt>
+    <w:sdtPr>
+      <w:lock w:val="contentLocked"/>
+      <w:id w:val="961370871"/>
+      <w:tag w:val="goog_rdk_0"/>
+    </w:sdtPr>
+    <w:sdtContent>
+      <w:tbl>
+        <w:tblPr>
+          <w:tblStyle w:val="Table3"/>
+          <w:tblW w:w="9486.000000000002" w:type="dxa"/>
+          <w:jc w:val="left"/>
+          <w:tblInd w:w="-115.0" w:type="dxa"/>
+          <w:tblBorders>
+            <w:top w:color="000000" w:space="0" w:sz="6" w:val="single"/>
+            <w:left w:color="000000" w:space="0" w:sz="6" w:val="single"/>
+            <w:bottom w:color="000000" w:space="0" w:sz="6" w:val="single"/>
+            <w:right w:color="000000" w:space="0" w:sz="6" w:val="single"/>
+            <w:insideH w:color="000000" w:space="0" w:sz="6" w:val="single"/>
+            <w:insideV w:color="000000" w:space="0" w:sz="6" w:val="single"/>
+          </w:tblBorders>
+          <w:tblLayout w:type="fixed"/>
+          <w:tblLook w:val="0000"/>
+        </w:tblPr>
+        <w:tblGrid>
+          <w:gridCol w:w="2628"/>
+          <w:gridCol w:w="3696"/>
+          <w:gridCol w:w="3162"/>
+          <w:tblGridChange w:id="0">
+            <w:tblGrid>
+              <w:gridCol w:w="2628"/>
+              <w:gridCol w:w="3696"/>
+              <w:gridCol w:w="3162"/>
+            </w:tblGrid>
+          </w:tblGridChange>
+        </w:tblGrid>
+        <w:tr>
+          <w:trPr>
+            <w:cantSplit w:val="0"/>
+            <w:tblHeader w:val="0"/>
+          </w:trPr>
+          <w:tc>
+            <w:tcPr>
+              <w:tcBorders>
+                <w:top w:color="000000" w:space="0" w:sz="0" w:val="nil"/>
+                <w:left w:color="000000" w:space="0" w:sz="0" w:val="nil"/>
+                <w:bottom w:color="000000" w:space="0" w:sz="0" w:val="nil"/>
+                <w:right w:color="000000" w:space="0" w:sz="0" w:val="nil"/>
+              </w:tcBorders>
+              <w:tcMar>
+                <w:top w:w="0.0" w:type="dxa"/>
+                <w:bottom w:w="0.0" w:type="dxa"/>
+              </w:tcMar>
+            </w:tcPr>
+            <w:p>
+              <w:pPr>
+                <w:ind w:right="360"/>
+                <w:rPr/>
+              </w:pPr>
+              <w:r>
+                <w:rPr>
+                  <w:rtl w:val="0"/>
+                </w:rPr>
+                <w:t xml:space="preserve">Confidential</w:t>
+              </w:r>
+            </w:p>
+          </w:tc>
+          <w:tc>
+            <w:tcPr>
+              <w:tcBorders>
+                <w:top w:color="000000" w:space="0" w:sz="0" w:val="nil"/>
+                <w:left w:color="000000" w:space="0" w:sz="0" w:val="nil"/>
+                <w:bottom w:color="000000" w:space="0" w:sz="0" w:val="nil"/>
+                <w:right w:color="000000" w:space="0" w:sz="0" w:val="nil"/>
+              </w:tcBorders>
+              <w:tcMar>
+                <w:top w:w="0.0" w:type="dxa"/>
+                <w:bottom w:w="0.0" w:type="dxa"/>
+              </w:tcMar>
+            </w:tcPr>
+            <w:p>
+              <w:pPr>
+                <w:jc w:val="center"/>
+                <w:rPr/>
+              </w:pPr>
+              <w:r>
+                <w:rPr>
+                  <w:rtl w:val="0"/>
+                </w:rPr>
+                <w:t xml:space="preserve">©Calculatorz</w:t>
+              </w:r>
+            </w:p>
+          </w:tc>
+          <w:tc>
+            <w:tcPr>
+              <w:tcBorders>
+                <w:top w:color="000000" w:space="0" w:sz="0" w:val="nil"/>
+                <w:left w:color="000000" w:space="0" w:sz="0" w:val="nil"/>
+                <w:bottom w:color="000000" w:space="0" w:sz="0" w:val="nil"/>
+                <w:right w:color="000000" w:space="0" w:sz="0" w:val="nil"/>
+              </w:tcBorders>
+              <w:tcMar>
+                <w:top w:w="0.0" w:type="dxa"/>
+                <w:bottom w:w="0.0" w:type="dxa"/>
+              </w:tcMar>
+            </w:tcPr>
+            <w:p>
+              <w:pPr>
+                <w:jc w:val="right"/>
+                <w:rPr/>
+              </w:pPr>
+              <w:r>
+                <w:rPr>
+                  <w:rtl w:val="0"/>
+                </w:rPr>
+                <w:t xml:space="preserve">Page </w:t>
+              </w:r>
+              <w:r>
+                <w:rPr/>
+                <w:fldChar w:fldCharType="begin"/>
+                <w:instrText xml:space="preserve">PAGE</w:instrText>
+                <w:fldChar w:fldCharType="separate"/>
+                <w:fldChar w:fldCharType="end"/>
+              </w:r>
+              <w:r>
+                <w:rPr>
+                  <w:rtl w:val="0"/>
+                </w:rPr>
+              </w:r>
+            </w:p>
+          </w:tc>
+        </w:tr>
+      </w:tbl>
+    </w:sdtContent>
+  </w:sdt>
+  <w:p>
+    <w:pPr>
+      <w:rPr/>
     </w:pPr>
     <w:r>
       <w:rPr>
@@ -6455,169 +6502,8 @@
 <w:hdr xmlns:mc="http://schemas.openxmlformats.org/markup-compatibility/2006" xmlns:o="urn:schemas-microsoft-com:office:office" xmlns:r="http://schemas.openxmlformats.org/officeDocument/2006/relationships" xmlns:m="http://schemas.openxmlformats.org/officeDocument/2006/math" xmlns:v="urn:schemas-microsoft-com:vml" xmlns:wp="http://schemas.openxmlformats.org/drawingml/2006/wordprocessingDrawing" xmlns:w10="urn:schemas-microsoft-com:office:word" xmlns:w="http://schemas.openxmlformats.org/wordprocessingml/2006/main" xmlns:wne="http://schemas.microsoft.com/office/word/2006/wordml" xmlns:sl="http://schemas.openxmlformats.org/schemaLibrary/2006/main" xmlns:a="http://schemas.openxmlformats.org/drawingml/2006/main" xmlns:pic="http://schemas.openxmlformats.org/drawingml/2006/picture" xmlns:c="http://schemas.openxmlformats.org/drawingml/2006/chart" xmlns:lc="http://schemas.openxmlformats.org/drawingml/2006/lockedCanvas" xmlns:dgm="http://schemas.openxmlformats.org/drawingml/2006/diagram" xmlns:wps="http://schemas.microsoft.com/office/word/2010/wordprocessingShape" xmlns:wpg="http://schemas.microsoft.com/office/word/2010/wordprocessingGroup" xmlns:w14="http://schemas.microsoft.com/office/word/2010/wordml" xmlns:w15="http://schemas.microsoft.com/office/word/2012/wordml" xmlns:w16="http://schemas.microsoft.com/office/word/2018/wordml" xmlns:w16cex="http://schemas.microsoft.com/office/word/2018/wordml/cex" xmlns:w16cid="http://schemas.microsoft.com/office/word/2016/wordml/cid" xmlns="http://schemas.microsoft.com/office/tasks/2019/documenttasks" xmlns:cr="http://schemas.microsoft.com/office/comments/2020/reactions">
   <w:p>
     <w:pPr>
-      <w:rPr>
-        <w:sz w:val="24"/>
-        <w:szCs w:val="24"/>
-      </w:rPr>
-    </w:pPr>
-    <w:r>
-      <w:rPr>
-        <w:rtl w:val="0"/>
-      </w:rPr>
-    </w:r>
-  </w:p>
-  <w:p>
-    <w:pPr>
-      <w:pBdr>
-        <w:top w:color="000000" w:space="1" w:sz="6" w:val="single"/>
-      </w:pBdr>
-      <w:rPr>
-        <w:sz w:val="24"/>
-        <w:szCs w:val="24"/>
-      </w:rPr>
-    </w:pPr>
-    <w:r>
-      <w:rPr>
-        <w:rtl w:val="0"/>
-      </w:rPr>
-    </w:r>
-  </w:p>
-  <w:p>
-    <w:pPr>
-      <w:pBdr>
-        <w:bottom w:color="000000" w:space="1" w:sz="6" w:val="single"/>
-      </w:pBdr>
-      <w:jc w:val="right"/>
-      <w:rPr>
-        <w:rFonts w:ascii="Arial" w:cs="Arial" w:eastAsia="Arial" w:hAnsi="Arial"/>
-        <w:b w:val="1"/>
-        <w:bCs w:val="1"/>
-        <w:sz w:val="36"/>
-        <w:szCs w:val="36"/>
-      </w:rPr>
-    </w:pPr>
-    <w:r>
-      <w:fldChar w:fldCharType="begin"/>
-      <w:instrText xml:space="preserve"> DOCPROPERTY "Company"</w:instrText>
-      <w:fldChar w:fldCharType="separate"/>
-    </w:r>
-    <w:r>
-      <w:rPr>
-        <w:rFonts w:ascii="Arial" w:cs="Arial" w:eastAsia="Arial" w:hAnsi="Arial"/>
-        <w:b w:val="1"/>
-        <w:bCs w:val="1"/>
-        <w:sz w:val="36"/>
-        <w:szCs w:val="36"/>
-        <w:rtl w:val="0"/>
-      </w:rPr>
-      <w:t xml:space="preserve">Calculatorz</w:t>
-    </w:r>
-    <w:r>
-      <w:fldChar w:fldCharType="end"/>
-    </w:r>
-    <w:r>
-      <w:rPr>
-        <w:rtl w:val="0"/>
-      </w:rPr>
-    </w:r>
-  </w:p>
-  <w:p>
-    <w:pPr>
-      <w:pBdr>
-        <w:bottom w:color="000000" w:space="1" w:sz="6" w:val="single"/>
-      </w:pBdr>
-      <w:jc w:val="right"/>
-      <w:rPr>
-        <w:sz w:val="24"/>
-        <w:szCs w:val="24"/>
-      </w:rPr>
-    </w:pPr>
-    <w:r>
-      <w:rPr>
-        <w:rtl w:val="0"/>
-      </w:rPr>
-    </w:r>
-  </w:p>
-  <w:p>
-    <w:pPr>
-      <w:keepNext w:val="0"/>
-      <w:keepLines w:val="0"/>
-      <w:pageBreakBefore w:val="0"/>
-      <w:widowControl w:val="0"/>
-      <w:pBdr>
-        <w:top w:space="0" w:sz="0" w:val="nil"/>
-        <w:left w:space="0" w:sz="0" w:val="nil"/>
-        <w:bottom w:space="0" w:sz="0" w:val="nil"/>
-        <w:right w:space="0" w:sz="0" w:val="nil"/>
-        <w:between w:space="0" w:sz="0" w:val="nil"/>
-      </w:pBdr>
-      <w:shd w:fill="auto" w:val="clear"/>
-      <w:tabs>
-        <w:tab w:val="center" w:leader="none" w:pos="4320"/>
-        <w:tab w:val="right" w:leader="none" w:pos="8640"/>
-      </w:tabs>
-      <w:spacing w:after="0" w:before="0" w:line="240" w:lineRule="auto"/>
-      <w:ind w:left="0" w:right="0" w:firstLine="0"/>
-      <w:jc w:val="left"/>
-      <w:rPr>
-        <w:rFonts w:ascii="Times New Roman" w:cs="Times New Roman" w:eastAsia="Times New Roman" w:hAnsi="Times New Roman"/>
-        <w:b w:val="0"/>
-        <w:bCs w:val="0"/>
-        <w:i w:val="0"/>
-        <w:iCs w:val="0"/>
-        <w:smallCaps w:val="0"/>
-        <w:strike w:val="0"/>
-        <w:color w:val="000000"/>
-        <w:sz w:val="20"/>
-        <w:szCs w:val="20"/>
-        <w:u w:val="none"/>
-        <w:shd w:fill="auto" w:val="clear"/>
-        <w:vertAlign w:val="baseline"/>
-      </w:rPr>
-    </w:pPr>
-    <w:r>
-      <w:rPr>
-        <w:rtl w:val="0"/>
-      </w:rPr>
-    </w:r>
-  </w:p>
-</w:hdr>
-</file>
-
-<file path=word/header2.xml><?xml version="1.0" encoding="utf-8"?>
-<w:hdr xmlns:mc="http://schemas.openxmlformats.org/markup-compatibility/2006" xmlns:o="urn:schemas-microsoft-com:office:office" xmlns:r="http://schemas.openxmlformats.org/officeDocument/2006/relationships" xmlns:m="http://schemas.openxmlformats.org/officeDocument/2006/math" xmlns:v="urn:schemas-microsoft-com:vml" xmlns:wp="http://schemas.openxmlformats.org/drawingml/2006/wordprocessingDrawing" xmlns:w10="urn:schemas-microsoft-com:office:word" xmlns:w="http://schemas.openxmlformats.org/wordprocessingml/2006/main" xmlns:wne="http://schemas.microsoft.com/office/word/2006/wordml" xmlns:sl="http://schemas.openxmlformats.org/schemaLibrary/2006/main" xmlns:a="http://schemas.openxmlformats.org/drawingml/2006/main" xmlns:pic="http://schemas.openxmlformats.org/drawingml/2006/picture" xmlns:c="http://schemas.openxmlformats.org/drawingml/2006/chart" xmlns:lc="http://schemas.openxmlformats.org/drawingml/2006/lockedCanvas" xmlns:dgm="http://schemas.openxmlformats.org/drawingml/2006/diagram" xmlns:wps="http://schemas.microsoft.com/office/word/2010/wordprocessingShape" xmlns:wpg="http://schemas.microsoft.com/office/word/2010/wordprocessingGroup" xmlns:w14="http://schemas.microsoft.com/office/word/2010/wordml" xmlns:w15="http://schemas.microsoft.com/office/word/2012/wordml" xmlns:w16="http://schemas.microsoft.com/office/word/2018/wordml" xmlns:w16cex="http://schemas.microsoft.com/office/word/2018/wordml/cex" xmlns:w16cid="http://schemas.microsoft.com/office/word/2016/wordml/cid" xmlns="http://schemas.microsoft.com/office/tasks/2019/documenttasks" xmlns:cr="http://schemas.microsoft.com/office/comments/2020/reactions">
-  <w:p>
-    <w:pPr>
-      <w:keepNext w:val="0"/>
-      <w:keepLines w:val="0"/>
-      <w:pageBreakBefore w:val="0"/>
-      <w:widowControl w:val="0"/>
-      <w:pBdr>
-        <w:top w:space="0" w:sz="0" w:val="nil"/>
-        <w:left w:space="0" w:sz="0" w:val="nil"/>
-        <w:bottom w:space="0" w:sz="0" w:val="nil"/>
-        <w:right w:space="0" w:sz="0" w:val="nil"/>
-        <w:between w:space="0" w:sz="0" w:val="nil"/>
-      </w:pBdr>
-      <w:shd w:fill="auto" w:val="clear"/>
-      <w:spacing w:after="0" w:before="0" w:line="276" w:lineRule="auto"/>
-      <w:ind w:left="0" w:right="0" w:firstLine="0"/>
-      <w:jc w:val="left"/>
-      <w:rPr>
-        <w:rFonts w:ascii="Times New Roman" w:cs="Times New Roman" w:eastAsia="Times New Roman" w:hAnsi="Times New Roman"/>
-        <w:b w:val="0"/>
-        <w:bCs w:val="0"/>
-        <w:i w:val="0"/>
-        <w:iCs w:val="0"/>
-        <w:smallCaps w:val="0"/>
-        <w:strike w:val="0"/>
-        <w:color w:val="000000"/>
-        <w:sz w:val="20"/>
-        <w:szCs w:val="20"/>
-        <w:u w:val="none"/>
-        <w:shd w:fill="auto" w:val="clear"/>
-        <w:vertAlign w:val="baseline"/>
-      </w:rPr>
+      <w:spacing w:line="276" w:lineRule="auto"/>
+      <w:rPr/>
     </w:pPr>
     <w:r>
       <w:rPr>
@@ -6655,7 +6541,7 @@
     <w:tr>
       <w:trPr>
         <w:cantSplit w:val="0"/>
-        <w:trHeight w:val="252.48046875" w:hRule="atLeast"/>
+        <w:trHeight w:val="252" w:hRule="atLeast"/>
         <w:tblHeader w:val="0"/>
       </w:trPr>
       <w:tc>
@@ -6668,7 +6554,6 @@
         </w:tcPr>
         <w:p>
           <w:pPr>
-            <w:spacing w:after="0" w:before="0" w:lineRule="auto"/>
             <w:rPr/>
           </w:pPr>
           <w:r>
@@ -6692,7 +6577,6 @@
             <w:tabs>
               <w:tab w:val="left" w:leader="none" w:pos="1170"/>
             </w:tabs>
-            <w:spacing w:after="0" w:before="0" w:lineRule="auto"/>
             <w:ind w:right="68"/>
             <w:rPr/>
           </w:pPr>
@@ -6702,7 +6586,7 @@
             </w:rPr>
             <w:t xml:space="preserve">  Version:</w:t>
             <w:tab/>
-            <w:t xml:space="preserve">1.1</w:t>
+            <w:t xml:space="preserve">1.2</w:t>
           </w:r>
         </w:p>
       </w:tc>
@@ -6710,7 +6594,7 @@
     <w:tr>
       <w:trPr>
         <w:cantSplit w:val="0"/>
-        <w:trHeight w:val="252.48046875" w:hRule="atLeast"/>
+        <w:trHeight w:val="252" w:hRule="atLeast"/>
         <w:tblHeader w:val="0"/>
       </w:trPr>
       <w:tc>
@@ -6723,7 +6607,6 @@
         </w:tcPr>
         <w:p>
           <w:pPr>
-            <w:spacing w:after="0" w:before="0" w:lineRule="auto"/>
             <w:rPr/>
           </w:pPr>
           <w:r>
@@ -6747,7 +6630,6 @@
             <w:tabs>
               <w:tab w:val="left" w:leader="none" w:pos="1170"/>
             </w:tabs>
-            <w:spacing w:after="0" w:before="0" w:lineRule="auto"/>
             <w:rPr/>
           </w:pPr>
           <w:r>
@@ -6756,7 +6638,7 @@
             </w:rPr>
             <w:t xml:space="preserve">  Date:</w:t>
             <w:tab/>
-            <w:t xml:space="preserve">2026-04-28</w:t>
+            <w:t xml:space="preserve">2026-05-06</w:t>
           </w:r>
         </w:p>
       </w:tc>
@@ -6808,44 +6690,83 @@
 </w:hdr>
 </file>
 
-<file path=word/header3.xml><?xml version="1.0" encoding="utf-8"?>
+<file path=word/header2.xml><?xml version="1.0" encoding="utf-8"?>
 <w:hdr xmlns:mc="http://schemas.openxmlformats.org/markup-compatibility/2006" xmlns:o="urn:schemas-microsoft-com:office:office" xmlns:r="http://schemas.openxmlformats.org/officeDocument/2006/relationships" xmlns:m="http://schemas.openxmlformats.org/officeDocument/2006/math" xmlns:v="urn:schemas-microsoft-com:vml" xmlns:wp="http://schemas.openxmlformats.org/drawingml/2006/wordprocessingDrawing" xmlns:w10="urn:schemas-microsoft-com:office:word" xmlns:w="http://schemas.openxmlformats.org/wordprocessingml/2006/main" xmlns:wne="http://schemas.microsoft.com/office/word/2006/wordml" xmlns:sl="http://schemas.openxmlformats.org/schemaLibrary/2006/main" xmlns:a="http://schemas.openxmlformats.org/drawingml/2006/main" xmlns:pic="http://schemas.openxmlformats.org/drawingml/2006/picture" xmlns:c="http://schemas.openxmlformats.org/drawingml/2006/chart" xmlns:lc="http://schemas.openxmlformats.org/drawingml/2006/lockedCanvas" xmlns:dgm="http://schemas.openxmlformats.org/drawingml/2006/diagram" xmlns:wps="http://schemas.microsoft.com/office/word/2010/wordprocessingShape" xmlns:wpg="http://schemas.microsoft.com/office/word/2010/wordprocessingGroup" xmlns:w14="http://schemas.microsoft.com/office/word/2010/wordml" xmlns:w15="http://schemas.microsoft.com/office/word/2012/wordml" xmlns:w16="http://schemas.microsoft.com/office/word/2018/wordml" xmlns:w16cex="http://schemas.microsoft.com/office/word/2018/wordml/cex" xmlns:w16cid="http://schemas.microsoft.com/office/word/2016/wordml/cid" xmlns="http://schemas.microsoft.com/office/tasks/2019/documenttasks" xmlns:cr="http://schemas.microsoft.com/office/comments/2020/reactions">
   <w:p>
     <w:pPr>
-      <w:keepNext w:val="0"/>
-      <w:keepLines w:val="0"/>
-      <w:pageBreakBefore w:val="0"/>
-      <w:widowControl w:val="0"/>
+      <w:rPr>
+        <w:sz w:val="24"/>
+        <w:szCs w:val="24"/>
+      </w:rPr>
+    </w:pPr>
+    <w:r>
+      <w:rPr>
+        <w:rtl w:val="0"/>
+      </w:rPr>
+    </w:r>
+  </w:p>
+  <w:p>
+    <w:pPr>
       <w:pBdr>
-        <w:top w:space="0" w:sz="0" w:val="nil"/>
-        <w:left w:space="0" w:sz="0" w:val="nil"/>
-        <w:bottom w:space="0" w:sz="0" w:val="nil"/>
-        <w:right w:space="0" w:sz="0" w:val="nil"/>
-        <w:between w:space="0" w:sz="0" w:val="nil"/>
+        <w:top w:color="000000" w:space="1" w:sz="6" w:val="single"/>
       </w:pBdr>
-      <w:shd w:fill="auto" w:val="clear"/>
-      <w:tabs>
-        <w:tab w:val="center" w:leader="none" w:pos="4320"/>
-        <w:tab w:val="right" w:leader="none" w:pos="8640"/>
-      </w:tabs>
-      <w:spacing w:after="0" w:before="0" w:line="240" w:lineRule="auto"/>
-      <w:ind w:left="0" w:right="0" w:firstLine="0"/>
-      <w:jc w:val="left"/>
       <w:rPr>
-        <w:rFonts w:ascii="Times New Roman" w:cs="Times New Roman" w:eastAsia="Times New Roman" w:hAnsi="Times New Roman"/>
-        <w:b w:val="0"/>
-        <w:bCs w:val="0"/>
-        <w:i w:val="0"/>
-        <w:iCs w:val="0"/>
-        <w:smallCaps w:val="0"/>
-        <w:strike w:val="0"/>
-        <w:color w:val="000000"/>
-        <w:sz w:val="20"/>
-        <w:szCs w:val="20"/>
-        <w:u w:val="none"/>
-        <w:shd w:fill="auto" w:val="clear"/>
-        <w:vertAlign w:val="baseline"/>
+        <w:sz w:val="24"/>
+        <w:szCs w:val="24"/>
       </w:rPr>
+    </w:pPr>
+    <w:r>
+      <w:rPr>
+        <w:rtl w:val="0"/>
+      </w:rPr>
+    </w:r>
+  </w:p>
+  <w:p>
+    <w:pPr>
+      <w:pBdr>
+        <w:bottom w:color="000000" w:space="1" w:sz="6" w:val="single"/>
+      </w:pBdr>
+      <w:jc w:val="right"/>
+      <w:rPr>
+        <w:rFonts w:ascii="Arial" w:cs="Arial" w:eastAsia="Arial" w:hAnsi="Arial"/>
+        <w:b w:val="1"/>
+        <w:bCs w:val="1"/>
+        <w:sz w:val="36"/>
+        <w:szCs w:val="36"/>
+      </w:rPr>
+    </w:pPr>
+    <w:r>
+      <w:rPr>
+        <w:rFonts w:ascii="Arial" w:cs="Arial" w:eastAsia="Arial" w:hAnsi="Arial"/>
+        <w:b w:val="1"/>
+        <w:bCs w:val="1"/>
+        <w:sz w:val="36"/>
+        <w:szCs w:val="36"/>
+        <w:rtl w:val="0"/>
+      </w:rPr>
+      <w:t xml:space="preserve">Calculatorz</w:t>
+    </w:r>
+  </w:p>
+  <w:p>
+    <w:pPr>
+      <w:pBdr>
+        <w:bottom w:color="000000" w:space="1" w:sz="6" w:val="single"/>
+      </w:pBdr>
+      <w:jc w:val="right"/>
+      <w:rPr>
+        <w:sz w:val="24"/>
+        <w:szCs w:val="24"/>
+      </w:rPr>
+    </w:pPr>
+    <w:r>
+      <w:rPr>
+        <w:rtl w:val="0"/>
+      </w:rPr>
+    </w:r>
+  </w:p>
+  <w:p>
+    <w:pPr>
+      <w:rPr/>
     </w:pPr>
     <w:r>
       <w:rPr>
@@ -7484,7 +7405,7 @@
 
 <file path=customXML/item1.xml><?xml version="1.0" encoding="utf-8"?>
 <go:gDocsCustomXmlDataStorage xmlns:go="http://customooxmlschemas.google.com/" xmlns:r="http://schemas.openxmlformats.org/officeDocument/2006/relationships" uri="GoogleDocsCustomDataVersion2">
-  <go:docsCustomData xmlns:go="http://customooxmlschemas.google.com/" roundtripDataSignature="AMtx7mjfzkjw+sENB75L5JSig9lcV1bzBg==">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</go:docsCustomData>
+  <go:docsCustomData xmlns:go="http://customooxmlschemas.google.com/" roundtripDataSignature="AMtx7mgAgNEA5Dr3+t5S6xy9hWajD8ywFw==">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</go:docsCustomData>
 </go:gDocsCustomXmlDataStorage>
 </file>
 

</xml_diff>